<commit_message>
Add the 3-minute ad and credit my role in the deck and notes
- Build60-ad.mp4: commercial-style cut, beat-synced to 120 BPM music,
  narrated by Kokoro "Michael".
- Growth plan: "How I built it" on slide 1, a "My role" strip on slide 5.
- Submission notes: a "How I worked with AI" section with the ideas and
  calls that were mine, plus what I did myself.

Co-Authored-By: Claude Opus 5.5 <noreply@anthropic.com>
</commit_message>
<xml_diff>
--- a/submission/Build60-Submission-Notes.docx
+++ b/submission/Build60-Submission-Notes.docx
@@ -244,7 +244,7 @@
             <w:pPr>
               <w:keepNext/>
             </w:pPr>
-            <w:hyperlink w:history="1" r:id="rIdfxqdgvtvlcse4cwsf_sr5">
+            <w:hyperlink w:history="1" r:id="rIdfob7zfskhncr4es2sxcvo">
               <w:r>
                 <w:rPr>
                   <w:rStyle w:val="Hyperlink"/>
@@ -332,6 +332,500 @@
         <w:spacing w:after="160" w:before="360"/>
       </w:pPr>
       <w:r>
+        <w:t xml:space="preserve">How I worked with AI</w:t>
+      </w:r>
+    </w:p>
+    <w:p>
+      <w:pPr>
+        <w:spacing w:after="120"/>
+      </w:pPr>
+      <w:r>
+        <w:t xml:space="preserve">I used Claude Code as my builder, not my author, and directed it inch by inch. Over two working sessions I gave it more than 40 instructions: what to build, what to cut, what to check and what wasn’t good enough yet. It wrote the code and the first drafts to that direction. These ideas and decisions were mine:</w:t>
+      </w:r>
+    </w:p>
+    <w:tbl>
+      <w:tblPr>
+        <w:tblW w:type="dxa" w:w="9638"/>
+        <w:tblBorders>
+          <w:top w:val="single" w:color="auto" w:sz="4"/>
+          <w:left w:val="single" w:color="auto" w:sz="4"/>
+          <w:bottom w:val="single" w:color="auto" w:sz="4"/>
+          <w:right w:val="single" w:color="auto" w:sz="4"/>
+          <w:insideH w:val="single" w:color="auto" w:sz="4"/>
+          <w:insideV w:val="single" w:color="auto" w:sz="4"/>
+        </w:tblBorders>
+      </w:tblPr>
+      <w:tblGrid>
+        <w:gridCol w:w="2300"/>
+        <w:gridCol w:w="7338"/>
+      </w:tblGrid>
+      <w:tr>
+        <w:trPr>
+          <w:cantSplit/>
+        </w:trPr>
+        <w:tc>
+          <w:tcPr>
+            <w:tcW w:type="dxa" w:w="2300"/>
+            <w:tcBorders>
+              <w:top w:val="single" w:color="16120E" w:sz="6"/>
+              <w:left w:val="single" w:color="16120E" w:sz="6"/>
+              <w:bottom w:val="single" w:color="16120E" w:sz="6"/>
+              <w:right w:val="single" w:color="16120E" w:sz="6"/>
+            </w:tcBorders>
+            <w:shd w:fill="E8E1D2" w:color="auto" w:val="clear"/>
+            <w:tcMar>
+              <w:top w:type="dxa" w:w="100"/>
+              <w:left w:type="dxa" w:w="140"/>
+              <w:bottom w:type="dxa" w:w="100"/>
+              <w:right w:type="dxa" w:w="140"/>
+            </w:tcMar>
+          </w:tcPr>
+          <w:p>
+            <w:pPr>
+              <w:keepNext/>
+            </w:pPr>
+            <w:r>
+              <w:rPr>
+                <w:rFonts w:ascii="Courier New" w:cs="Courier New" w:eastAsia="Courier New" w:hAnsi="Courier New"/>
+                <w:b/>
+                <w:bCs/>
+                <w:color w:val="16120E"/>
+                <w:sz w:val="18"/>
+                <w:szCs w:val="18"/>
+              </w:rPr>
+              <w:t xml:space="preserve">THE CHALLENGE</w:t>
+            </w:r>
+          </w:p>
+        </w:tc>
+        <w:tc>
+          <w:tcPr>
+            <w:tcW w:type="dxa" w:w="7338"/>
+            <w:tcBorders>
+              <w:top w:val="single" w:color="16120E" w:sz="6"/>
+              <w:left w:val="single" w:color="16120E" w:sz="6"/>
+              <w:bottom w:val="single" w:color="16120E" w:sz="6"/>
+              <w:right w:val="single" w:color="16120E" w:sz="6"/>
+            </w:tcBorders>
+            <w:shd w:fill="FBF8F1" w:color="auto" w:val="clear"/>
+            <w:tcMar>
+              <w:top w:type="dxa" w:w="100"/>
+              <w:left w:type="dxa" w:w="160"/>
+              <w:bottom w:type="dxa" w:w="100"/>
+              <w:right w:type="dxa" w:w="160"/>
+            </w:tcMar>
+          </w:tcPr>
+          <w:p>
+            <w:pPr>
+              <w:keepNext/>
+            </w:pPr>
+            <w:r>
+              <w:t xml:space="preserve">The 60-minute challenge was my idea. After registering and sharing on WhatsApp, LinkedIn, Instagram or X, a student chooses when to start the timer, sees their challenge, and submits a GitHub repo, a zip, a live link or a video. The admin sees every submission with its AI score, and can upload questions or have the AI generate separate variants and assign them at random.</w:t>
+            </w:r>
+          </w:p>
+        </w:tc>
+      </w:tr>
+      <w:tr>
+        <w:trPr>
+          <w:cantSplit/>
+        </w:trPr>
+        <w:tc>
+          <w:tcPr>
+            <w:tcW w:type="dxa" w:w="2300"/>
+            <w:tcBorders>
+              <w:top w:val="single" w:color="16120E" w:sz="6"/>
+              <w:left w:val="single" w:color="16120E" w:sz="6"/>
+              <w:bottom w:val="single" w:color="16120E" w:sz="6"/>
+              <w:right w:val="single" w:color="16120E" w:sz="6"/>
+            </w:tcBorders>
+            <w:shd w:fill="E8E1D2" w:color="auto" w:val="clear"/>
+            <w:tcMar>
+              <w:top w:type="dxa" w:w="100"/>
+              <w:left w:type="dxa" w:w="140"/>
+              <w:bottom w:type="dxa" w:w="100"/>
+              <w:right w:type="dxa" w:w="140"/>
+            </w:tcMar>
+          </w:tcPr>
+          <w:p>
+            <w:pPr>
+              <w:keepNext/>
+            </w:pPr>
+            <w:r>
+              <w:rPr>
+                <w:rFonts w:ascii="Courier New" w:cs="Courier New" w:eastAsia="Courier New" w:hAnsi="Courier New"/>
+                <w:b/>
+                <w:bCs/>
+                <w:color w:val="16120E"/>
+                <w:sz w:val="18"/>
+                <w:szCs w:val="18"/>
+              </w:rPr>
+              <w:t xml:space="preserve">AI SETTINGS</w:t>
+            </w:r>
+          </w:p>
+        </w:tc>
+        <w:tc>
+          <w:tcPr>
+            <w:tcW w:type="dxa" w:w="7338"/>
+            <w:tcBorders>
+              <w:top w:val="single" w:color="16120E" w:sz="6"/>
+              <w:left w:val="single" w:color="16120E" w:sz="6"/>
+              <w:bottom w:val="single" w:color="16120E" w:sz="6"/>
+              <w:right w:val="single" w:color="16120E" w:sz="6"/>
+            </w:tcBorders>
+            <w:shd w:fill="FBF8F1" w:color="auto" w:val="clear"/>
+            <w:tcMar>
+              <w:top w:type="dxa" w:w="100"/>
+              <w:left w:type="dxa" w:w="160"/>
+              <w:bottom w:type="dxa" w:w="100"/>
+              <w:right w:type="dxa" w:w="160"/>
+            </w:tcMar>
+          </w:tcPr>
+          <w:p>
+            <w:pPr>
+              <w:keepNext/>
+            </w:pPr>
+            <w:r>
+              <w:t xml:space="preserve">I asked for the admin to choose between local models (Qwen, Llama) and an API key, with the key hidden until the admin password is entered. Later I added a rule: no model gets downloaded until a local one is actually selected.</w:t>
+            </w:r>
+          </w:p>
+        </w:tc>
+      </w:tr>
+      <w:tr>
+        <w:trPr>
+          <w:cantSplit/>
+        </w:trPr>
+        <w:tc>
+          <w:tcPr>
+            <w:tcW w:type="dxa" w:w="2300"/>
+            <w:tcBorders>
+              <w:top w:val="single" w:color="16120E" w:sz="6"/>
+              <w:left w:val="single" w:color="16120E" w:sz="6"/>
+              <w:bottom w:val="single" w:color="16120E" w:sz="6"/>
+              <w:right w:val="single" w:color="16120E" w:sz="6"/>
+            </w:tcBorders>
+            <w:shd w:fill="E8E1D2" w:color="auto" w:val="clear"/>
+            <w:tcMar>
+              <w:top w:type="dxa" w:w="100"/>
+              <w:left w:type="dxa" w:w="140"/>
+              <w:bottom w:type="dxa" w:w="100"/>
+              <w:right w:type="dxa" w:w="140"/>
+            </w:tcMar>
+          </w:tcPr>
+          <w:p>
+            <w:pPr>
+              <w:keepNext/>
+            </w:pPr>
+            <w:r>
+              <w:rPr>
+                <w:rFonts w:ascii="Courier New" w:cs="Courier New" w:eastAsia="Courier New" w:hAnsi="Courier New"/>
+                <w:b/>
+                <w:bCs/>
+                <w:color w:val="16120E"/>
+                <w:sz w:val="18"/>
+                <w:szCs w:val="18"/>
+              </w:rPr>
+              <w:t xml:space="preserve">COST</w:t>
+            </w:r>
+          </w:p>
+        </w:tc>
+        <w:tc>
+          <w:tcPr>
+            <w:tcW w:type="dxa" w:w="7338"/>
+            <w:tcBorders>
+              <w:top w:val="single" w:color="16120E" w:sz="6"/>
+              <w:left w:val="single" w:color="16120E" w:sz="6"/>
+              <w:bottom w:val="single" w:color="16120E" w:sz="6"/>
+              <w:right w:val="single" w:color="16120E" w:sz="6"/>
+            </w:tcBorders>
+            <w:shd w:fill="FBF8F1" w:color="auto" w:val="clear"/>
+            <w:tcMar>
+              <w:top w:type="dxa" w:w="100"/>
+              <w:left w:type="dxa" w:w="160"/>
+              <w:bottom w:type="dxa" w:w="100"/>
+              <w:right w:type="dxa" w:w="160"/>
+            </w:tcMar>
+          </w:tcPr>
+          <w:p>
+            <w:pPr>
+              <w:keepNext/>
+            </w:pPr>
+            <w:r>
+              <w:t xml:space="preserve">I asked whether we needed a paid API and decided against it. The whole stack runs on free tiers, and I got the free Gemini key myself.</w:t>
+            </w:r>
+          </w:p>
+        </w:tc>
+      </w:tr>
+      <w:tr>
+        <w:trPr>
+          <w:cantSplit/>
+        </w:trPr>
+        <w:tc>
+          <w:tcPr>
+            <w:tcW w:type="dxa" w:w="2300"/>
+            <w:tcBorders>
+              <w:top w:val="single" w:color="16120E" w:sz="6"/>
+              <w:left w:val="single" w:color="16120E" w:sz="6"/>
+              <w:bottom w:val="single" w:color="16120E" w:sz="6"/>
+              <w:right w:val="single" w:color="16120E" w:sz="6"/>
+            </w:tcBorders>
+            <w:shd w:fill="E8E1D2" w:color="auto" w:val="clear"/>
+            <w:tcMar>
+              <w:top w:type="dxa" w:w="100"/>
+              <w:left w:type="dxa" w:w="140"/>
+              <w:bottom w:type="dxa" w:w="100"/>
+              <w:right w:type="dxa" w:w="140"/>
+            </w:tcMar>
+          </w:tcPr>
+          <w:p>
+            <w:pPr>
+              <w:keepNext/>
+            </w:pPr>
+            <w:r>
+              <w:rPr>
+                <w:rFonts w:ascii="Courier New" w:cs="Courier New" w:eastAsia="Courier New" w:hAnsi="Courier New"/>
+                <w:b/>
+                <w:bCs/>
+                <w:color w:val="16120E"/>
+                <w:sz w:val="18"/>
+                <w:szCs w:val="18"/>
+              </w:rPr>
+              <w:t xml:space="preserve">SCOPE</w:t>
+            </w:r>
+          </w:p>
+        </w:tc>
+        <w:tc>
+          <w:tcPr>
+            <w:tcW w:type="dxa" w:w="7338"/>
+            <w:tcBorders>
+              <w:top w:val="single" w:color="16120E" w:sz="6"/>
+              <w:left w:val="single" w:color="16120E" w:sz="6"/>
+              <w:bottom w:val="single" w:color="16120E" w:sz="6"/>
+              <w:right w:val="single" w:color="16120E" w:sz="6"/>
+            </w:tcBorders>
+            <w:shd w:fill="FBF8F1" w:color="auto" w:val="clear"/>
+            <w:tcMar>
+              <w:top w:type="dxa" w:w="100"/>
+              <w:left w:type="dxa" w:w="160"/>
+              <w:bottom w:type="dxa" w:w="100"/>
+              <w:right w:type="dxa" w:w="160"/>
+            </w:tcMar>
+          </w:tcPr>
+          <w:p>
+            <w:pPr>
+              <w:keepNext/>
+            </w:pPr>
+            <w:r>
+              <w:t xml:space="preserve">I kept checking the work against the brief: “Did they ask to deploy?”, “What do we need an LLM for?”, “Did we do more than they asked?”. When I asked for ways to make it stand out, I chose share cards and trustworthy grading from the options.</w:t>
+            </w:r>
+          </w:p>
+        </w:tc>
+      </w:tr>
+      <w:tr>
+        <w:trPr>
+          <w:cantSplit/>
+        </w:trPr>
+        <w:tc>
+          <w:tcPr>
+            <w:tcW w:type="dxa" w:w="2300"/>
+            <w:tcBorders>
+              <w:top w:val="single" w:color="16120E" w:sz="6"/>
+              <w:left w:val="single" w:color="16120E" w:sz="6"/>
+              <w:bottom w:val="single" w:color="16120E" w:sz="6"/>
+              <w:right w:val="single" w:color="16120E" w:sz="6"/>
+            </w:tcBorders>
+            <w:shd w:fill="E8E1D2" w:color="auto" w:val="clear"/>
+            <w:tcMar>
+              <w:top w:type="dxa" w:w="100"/>
+              <w:left w:type="dxa" w:w="140"/>
+              <w:bottom w:type="dxa" w:w="100"/>
+              <w:right w:type="dxa" w:w="140"/>
+            </w:tcMar>
+          </w:tcPr>
+          <w:p>
+            <w:pPr>
+              <w:keepNext/>
+            </w:pPr>
+            <w:r>
+              <w:rPr>
+                <w:rFonts w:ascii="Courier New" w:cs="Courier New" w:eastAsia="Courier New" w:hAnsi="Courier New"/>
+                <w:b/>
+                <w:bCs/>
+                <w:color w:val="16120E"/>
+                <w:sz w:val="18"/>
+                <w:szCs w:val="18"/>
+              </w:rPr>
+              <w:t xml:space="preserve">QUALITY BAR</w:t>
+            </w:r>
+          </w:p>
+        </w:tc>
+        <w:tc>
+          <w:tcPr>
+            <w:tcW w:type="dxa" w:w="7338"/>
+            <w:tcBorders>
+              <w:top w:val="single" w:color="16120E" w:sz="6"/>
+              <w:left w:val="single" w:color="16120E" w:sz="6"/>
+              <w:bottom w:val="single" w:color="16120E" w:sz="6"/>
+              <w:right w:val="single" w:color="16120E" w:sz="6"/>
+            </w:tcBorders>
+            <w:shd w:fill="FBF8F1" w:color="auto" w:val="clear"/>
+            <w:tcMar>
+              <w:top w:type="dxa" w:w="100"/>
+              <w:left w:type="dxa" w:w="160"/>
+              <w:bottom w:type="dxa" w:w="100"/>
+              <w:right w:type="dxa" w:w="160"/>
+            </w:tcMar>
+          </w:tcPr>
+          <w:p>
+            <w:pPr>
+              <w:keepNext/>
+            </w:pPr>
+            <w:r>
+              <w:t xml:space="preserve">“The UI shouldn’t look AI-generated.” I asked for a proper database, more Indian colleges, dark mode and then light mode by default for everyone, a check for anything left unfinished, a full security review, and finally a redesign with animated components and 3D.</w:t>
+            </w:r>
+          </w:p>
+        </w:tc>
+      </w:tr>
+      <w:tr>
+        <w:trPr>
+          <w:cantSplit/>
+        </w:trPr>
+        <w:tc>
+          <w:tcPr>
+            <w:tcW w:type="dxa" w:w="2300"/>
+            <w:tcBorders>
+              <w:top w:val="single" w:color="16120E" w:sz="6"/>
+              <w:left w:val="single" w:color="16120E" w:sz="6"/>
+              <w:bottom w:val="single" w:color="16120E" w:sz="6"/>
+              <w:right w:val="single" w:color="16120E" w:sz="6"/>
+            </w:tcBorders>
+            <w:shd w:fill="E8E1D2" w:color="auto" w:val="clear"/>
+            <w:tcMar>
+              <w:top w:type="dxa" w:w="100"/>
+              <w:left w:type="dxa" w:w="140"/>
+              <w:bottom w:type="dxa" w:w="100"/>
+              <w:right w:type="dxa" w:w="140"/>
+            </w:tcMar>
+          </w:tcPr>
+          <w:p>
+            <w:pPr>
+              <w:keepNext w:val="false"/>
+            </w:pPr>
+            <w:r>
+              <w:rPr>
+                <w:rFonts w:ascii="Courier New" w:cs="Courier New" w:eastAsia="Courier New" w:hAnsi="Courier New"/>
+                <w:b/>
+                <w:bCs/>
+                <w:color w:val="16120E"/>
+                <w:sz w:val="18"/>
+                <w:szCs w:val="18"/>
+              </w:rPr>
+              <w:t xml:space="preserve">THE VIDEO</w:t>
+            </w:r>
+          </w:p>
+        </w:tc>
+        <w:tc>
+          <w:tcPr>
+            <w:tcW w:type="dxa" w:w="7338"/>
+            <w:tcBorders>
+              <w:top w:val="single" w:color="16120E" w:sz="6"/>
+              <w:left w:val="single" w:color="16120E" w:sz="6"/>
+              <w:bottom w:val="single" w:color="16120E" w:sz="6"/>
+              <w:right w:val="single" w:color="16120E" w:sz="6"/>
+            </w:tcBorders>
+            <w:shd w:fill="FBF8F1" w:color="auto" w:val="clear"/>
+            <w:tcMar>
+              <w:top w:type="dxa" w:w="100"/>
+              <w:left w:type="dxa" w:w="160"/>
+              <w:bottom w:type="dxa" w:w="100"/>
+              <w:right w:type="dxa" w:w="160"/>
+            </w:tcMar>
+          </w:tcPr>
+          <w:p>
+            <w:pPr>
+              <w:keepNext w:val="false"/>
+            </w:pPr>
+            <w:r>
+              <w:t xml:space="preserve">I rejected the first narration, both the voice and what it said, and asked for a professional ad instead. I chose the voice, the structure (an ad first, then my pitch) and that it’s told in first person.</w:t>
+            </w:r>
+          </w:p>
+        </w:tc>
+      </w:tr>
+    </w:tbl>
+    <w:p>
+      <w:pPr>
+        <w:pStyle w:val="Heading2"/>
+        <w:keepNext/>
+        <w:spacing w:after="120" w:before="280"/>
+      </w:pPr>
+      <w:r>
+        <w:t xml:space="preserve">What I did myself</w:t>
+      </w:r>
+    </w:p>
+    <w:p>
+      <w:pPr>
+        <w:pStyle w:val="ListParagraph"/>
+        <w:numPr>
+          <w:ilvl w:val="0"/>
+          <w:numId w:val="2"/>
+        </w:numPr>
+        <w:spacing w:after="80"/>
+      </w:pPr>
+      <w:r>
+        <w:t xml:space="preserve">Created the GitHub repository and connected the project to it.</w:t>
+      </w:r>
+    </w:p>
+    <w:p>
+      <w:pPr>
+        <w:pStyle w:val="ListParagraph"/>
+        <w:numPr>
+          <w:ilvl w:val="0"/>
+          <w:numId w:val="2"/>
+        </w:numPr>
+        <w:spacing w:after="80"/>
+      </w:pPr>
+      <w:r>
+        <w:t xml:space="preserve">Got the free Gemini API key that powers the AI features.</w:t>
+      </w:r>
+    </w:p>
+    <w:p>
+      <w:pPr>
+        <w:pStyle w:val="ListParagraph"/>
+        <w:numPr>
+          <w:ilvl w:val="0"/>
+          <w:numId w:val="2"/>
+        </w:numPr>
+        <w:spacing w:after="80"/>
+      </w:pPr>
+      <w:r>
+        <w:t xml:space="preserve">Ran the app and watched the video drafts, and sent back what wasn’t right.</w:t>
+      </w:r>
+    </w:p>
+    <w:p>
+      <w:pPr>
+        <w:pStyle w:val="ListParagraph"/>
+        <w:numPr>
+          <w:ilvl w:val="0"/>
+          <w:numId w:val="2"/>
+        </w:numPr>
+        <w:spacing w:after="80"/>
+      </w:pPr>
+      <w:r>
+        <w:t xml:space="preserve">Deployed the site on Vercel with a Neon Postgres database, and set the admin password there. </w:t>
+      </w:r>
+      <w:r>
+        <w:rPr>
+          <w:b/>
+          <w:bCs/>
+          <w:highlight w:val="yellow"/>
+        </w:rPr>
+        <w:t xml:space="preserve">[Delete this line if you haven’t deployed yet]</w:t>
+      </w:r>
+    </w:p>
+    <w:p>
+      <w:pPr>
+        <w:pStyle w:val="Heading1"/>
+        <w:spacing w:after="160" w:before="360"/>
+      </w:pPr>
+      <w:r>
         <w:t xml:space="preserve">AI + learning notes</w:t>
       </w:r>
     </w:p>
@@ -340,7 +834,7 @@
         <w:spacing w:after="120"/>
       </w:pPr>
       <w:r>
-        <w:t xml:space="preserve">I built this with AI throughout (Claude Code for the app and these documents). Three examples of what I asked, what the AI suggested, and what I changed as a result.</w:t>
+        <w:t xml:space="preserve">Three examples of what I asked, what the AI suggested, and what changed as a result.</w:t>
       </w:r>
     </w:p>
     <w:p>
@@ -1504,15 +1998,7 @@
         <w:t xml:space="preserve">I went the other way and redesigned the whole site with animated components and a Three.js hero, </w:t>
       </w:r>
       <w:r>
-        <w:t xml:space="preserve">because the brief explicitly rewards a more complex, more effective asset, and the asset is the first thing a reviewer opens. </w:t>
-      </w:r>
-      <w:r>
-        <w:rPr>
-          <w:b/>
-          <w:bCs/>
-          <w:highlight w:val="yellow"/>
-        </w:rPr>
-        <w:t xml:space="preserve">[Confirm this is your reason, or replace it with your own]</w:t>
+        <w:t xml:space="preserve">because the brief explicitly rewards a more complex, more effective asset, and the asset is the first thing a reviewer opens.</w:t>
       </w:r>
     </w:p>
     <w:p>
@@ -1528,12 +2014,7 @@
         <w:spacing w:after="120"/>
       </w:pPr>
       <w:r>
-        <w:rPr>
-          <w:b/>
-          <w:bCs/>
-          <w:highlight w:val="yellow"/>
-        </w:rPr>
-        <w:t xml:space="preserve">[Optional: add one thing another AI tool suggested that you rejected]</w:t>
+        <w:t xml:space="preserve">That is how the whole project went. I didn’t take the AI’s output as it came: I suggested the features and asked for every change, inch by inch, from the challenge flow and the AI settings to the security checks, the light-mode default, and the video’s voice and script.</w:t>
       </w:r>
     </w:p>
     <w:sectPr>

</xml_diff>